<commit_message>
Update skill sheet 0417: unify training count + sync role names
職務経歴書0417を正として役職名と研修受講者数を修正:
- 研修受講者数: 200名超 → 100名超（職務経歴書と統一）
- STANDARD役職: Senior Manager / 生成AIサービス責任者 → Senior Manager
- Amazon役職: Senior Data Scientist → アソシエイトプリンシパル
- M3役職: BIチームリーダー / Senior Data Analyst → BIチームリーダー

レイアウト・その他の内容は維持。
</commit_message>
<xml_diff>
--- a/Oza_skill_sheet_20260417.docx
+++ b/Oza_skill_sheet_20260417.docx
@@ -1072,7 +1072,7 @@
                 <w:color w:val="A8C4E0"/>
                 <w:sz w:val="17"/>
               </w:rPr>
-              <w:t>Senior Manager / 生成AIサービス責任者</w:t>
+              <w:t>Senior Manager</w:t>
             </w:r>
           </w:p>
         </w:tc>
@@ -1276,7 +1276,7 @@
           <w:sz w:val="17"/>
           <w:lang w:eastAsia="ja-JP"/>
         </w:rPr>
-        <w:t>▶  エグゼクティブ研修プログラム設計・講師担当（参加者200名超）</w:t>
+        <w:t>▶  エグゼクティブ研修プログラム設計・講師担当（参加者100名超）</w:t>
       </w:r>
     </w:p>
     <w:p>
@@ -1375,7 +1375,7 @@
                 <w:color w:val="A8C4E0"/>
                 <w:sz w:val="17"/>
               </w:rPr>
-              <w:t>Senior Data Scientist</w:t>
+              <w:t>アソシエイトプリンシパル</w:t>
             </w:r>
           </w:p>
         </w:tc>
@@ -1652,7 +1652,7 @@
                 <w:color w:val="A8C4E0"/>
                 <w:sz w:val="17"/>
               </w:rPr>
-              <w:t>BIチームリーダー / Senior Data Analyst</w:t>
+              <w:t>BIチームリーダー</w:t>
             </w:r>
           </w:p>
         </w:tc>

</xml_diff>